<commit_message>
DOCX viewer: numbering.xml resolver and DrawingML JPEG images
Parse abstractNum/num/lvl for bullets, decimals, letters, and multi-level
lvlText markers. Resolve document relationships and inline a:blip pictures
to SoftCanvas via the pdf_writer JPEG decoder. Adds images_demo fixture.

Co-authored-by: Tero <terotests@users.noreply.github.com>
</commit_message>
<xml_diff>
--- a/gallery/docx_viewer/fixtures/hello.docx
+++ b/gallery/docx_viewer/fixtures/hello.docx
@@ -1,6 +1,6 @@
 
 <file path=word/document.xml><?xml version="1.0" encoding="utf-8"?>
-<w:document xmlns:w="http://schemas.openxmlformats.org/wordprocessingml/2006/main">
+<w:document xmlns:w="http://schemas.openxmlformats.org/wordprocessingml/2006/main" xmlns:r="http://schemas.openxmlformats.org/officeDocument/2006/relationships">
   <w:body>
     <w:p>
       <w:pPr>
@@ -81,11 +81,32 @@
       </w:pPr>
     </w:lvl>
   </w:abstractNum>
+  <w:abstractNum w:abstractNumId="2">
+    <w:lvl w:ilvl="0">
+      <w:start w:val="1"/>
+      <w:numFmt w:val="decimal"/>
+      <w:lvlText w:val="%1."/>
+      <w:pPr>
+        <w:ind w:left="720" w:hanging="360"/>
+      </w:pPr>
+    </w:lvl>
+    <w:lvl w:ilvl="1">
+      <w:start w:val="1"/>
+      <w:numFmt w:val="lowerLetter"/>
+      <w:lvlText w:val="%1.%2)"/>
+      <w:pPr>
+        <w:ind w:left="1440" w:hanging="360"/>
+      </w:pPr>
+    </w:lvl>
+  </w:abstractNum>
   <w:num w:numId="1">
     <w:abstractNumId w:val="0"/>
   </w:num>
   <w:num w:numId="2">
     <w:abstractNumId w:val="1"/>
+  </w:num>
+  <w:num w:numId="3">
+    <w:abstractNumId w:val="2"/>
   </w:num>
 </w:numbering>
 </file>
@@ -115,7 +136,6 @@
     <w:qFormat/>
     <w:pPr>
       <w:spacing w:before="240" w:after="120"/>
-      <w:jc w:val="left"/>
     </w:pPr>
     <w:rPr>
       <w:b/>

</xml_diff>

<commit_message>
Add DOCX viewer fixtures and oracle harness.
Expand make_fixtures.py with tables, sections, headers/footers, mixed
images, and a business-report kitchen sink. Add semantic/visual oracles,
run_oracles.mjs, docx_oracle_dump, and inspectJson for Ranger dumps.

Co-authored-by: Tero <terotests@users.noreply.github.com>
</commit_message>
<xml_diff>
--- a/gallery/docx_viewer/fixtures/hello.docx
+++ b/gallery/docx_viewer/fixtures/hello.docx
@@ -51,7 +51,7 @@
         <w:t xml:space="preserve">This sample is a minimal WordprocessingML package (ZIP + OPC parts).</w:t>
       </w:r>
     </w:p>
-    <w:sectPr>
+    <w:sectPr xmlns:r="http://schemas.openxmlformats.org/officeDocument/2006/relationships">
       <w:pgSz w:w="12240" w:h="15840"/>
       <w:pgMar w:top="1440" w:right="1440" w:bottom="1440" w:left="1440"/>
     </w:sectPr>
@@ -68,6 +68,14 @@
       <w:lvlText w:val="•"/>
       <w:pPr>
         <w:ind w:left="720" w:hanging="360"/>
+      </w:pPr>
+    </w:lvl>
+    <w:lvl w:ilvl="1">
+      <w:start w:val="1"/>
+      <w:numFmt w:val="bullet"/>
+      <w:lvlText w:val="○"/>
+      <w:pPr>
+        <w:ind w:left="1440" w:hanging="360"/>
       </w:pPr>
     </w:lvl>
   </w:abstractNum>
@@ -93,9 +101,17 @@
     <w:lvl w:ilvl="1">
       <w:start w:val="1"/>
       <w:numFmt w:val="lowerLetter"/>
-      <w:lvlText w:val="%1.%2)"/>
+      <w:lvlText w:val="%2)"/>
       <w:pPr>
         <w:ind w:left="1440" w:hanging="360"/>
+      </w:pPr>
+    </w:lvl>
+    <w:lvl w:ilvl="2">
+      <w:start w:val="1"/>
+      <w:numFmt w:val="lowerRoman"/>
+      <w:lvlText w:val="%3."/>
+      <w:pPr>
+        <w:ind w:left="2160" w:hanging="360"/>
       </w:pPr>
     </w:lvl>
   </w:abstractNum>

</xml_diff>

<commit_message>
DOCX viewer fidelity: tables, pagination, styles, oracles
Grow gallery/docx_viewer from a paragraph/style demo into a multi-page
business-document viewer: Word tables in flow layout, sectPr pagination,
headers/footers, deeper style inheritance, JPEG+PNG images, business-report
fixture, SoftCanvas window host, and python-docx / LibreOffice oracles.

Co-authored-by: Tero <terotests@users.noreply.github.com>
</commit_message>
<xml_diff>
--- a/gallery/docx_viewer/fixtures/hello.docx
+++ b/gallery/docx_viewer/fixtures/hello.docx
@@ -24,7 +24,7 @@
         <w:t xml:space="preserve">world</w:t>
       </w:r>
       <w:r>
-        <w:t xml:space="preserve"> — </w:t>
+        <w:t xml:space="preserve"> -- </w:t>
       </w:r>
       <w:r>
         <w:rPr>
@@ -51,7 +51,7 @@
         <w:t xml:space="preserve">This sample is a minimal WordprocessingML package (ZIP + OPC parts).</w:t>
       </w:r>
     </w:p>
-    <w:sectPr>
+    <w:sectPr xmlns:r="http://schemas.openxmlformats.org/officeDocument/2006/relationships">
       <w:pgSz w:w="12240" w:h="15840"/>
       <w:pgMar w:top="1440" w:right="1440" w:bottom="1440" w:left="1440"/>
     </w:sectPr>
@@ -65,9 +65,17 @@
     <w:lvl w:ilvl="0">
       <w:start w:val="1"/>
       <w:numFmt w:val="bullet"/>
-      <w:lvlText w:val="•"/>
+      <w:lvlText w:val="-"/>
       <w:pPr>
         <w:ind w:left="720" w:hanging="360"/>
+      </w:pPr>
+    </w:lvl>
+    <w:lvl w:ilvl="1">
+      <w:start w:val="1"/>
+      <w:numFmt w:val="bullet"/>
+      <w:lvlText w:val="-"/>
+      <w:pPr>
+        <w:ind w:left="1440" w:hanging="360"/>
       </w:pPr>
     </w:lvl>
   </w:abstractNum>
@@ -93,9 +101,17 @@
     <w:lvl w:ilvl="1">
       <w:start w:val="1"/>
       <w:numFmt w:val="lowerLetter"/>
-      <w:lvlText w:val="%1.%2)"/>
+      <w:lvlText w:val="%2)"/>
       <w:pPr>
         <w:ind w:left="1440" w:hanging="360"/>
+      </w:pPr>
+    </w:lvl>
+    <w:lvl w:ilvl="2">
+      <w:start w:val="1"/>
+      <w:numFmt w:val="lowerRoman"/>
+      <w:lvlText w:val="%3."/>
+      <w:pPr>
+        <w:ind w:left="2160" w:hanging="360"/>
       </w:pPr>
     </w:lvl>
   </w:abstractNum>

</xml_diff>